<commit_message>
SSL: el informe recoge tambien la correccion de la captura de trafico
El commit anterior arreglo la guia y el guion, pero el .docx se regenero sin
cambios porque la edicion del generador habia fallado en silencio.

Co-Authored-By: Claude Opus 5 <noreply@anthropic.com>
</commit_message>
<xml_diff>
--- a/Taller/Taller-cifrado/docs/pineda-juan-ssl.docx
+++ b/Taller/Taller-cifrado/docs/pineda-juan-ssl.docx
@@ -1176,7 +1176,20 @@
                 <w:sz w:val="20"/>
                 <w:szCs w:val="20"/>
               </w:rPr>
-              <w:t xml:space="preserve">sudo tcpdump -i any -A -s0 'tcp port 80 and host santafe-pineda.shop'</w:t>
+              <w:t xml:space="preserve">sudo tcpdump -i any -s0 -w /tmp/captura.pcap 'tcp port 80'</w:t>
+            </w:r>
+          </w:p>
+          <w:p>
+            <w:pPr>
+              <w:spacing w:after="0" w:before="0" w:line="240"/>
+            </w:pPr>
+            <w:r>
+              <w:rPr>
+                <w:rFonts w:ascii="Consolas" w:cs="Consolas" w:eastAsia="Consolas" w:hAnsi="Consolas"/>
+                <w:sz w:val="20"/>
+                <w:szCs w:val="20"/>
+              </w:rPr>
+              <w:t xml:space="preserve">sudo tcpdump -r /tmp/captura.pcap -A | grep -A25 'POST /api/auth/login'</w:t>
             </w:r>
           </w:p>
           <w:p>
@@ -1270,6 +1283,34 @@
           <w:szCs w:val="22"/>
         </w:rPr>
         <w:t xml:space="preserve"/>
+      </w:r>
+    </w:p>
+    <w:p>
+      <w:pPr>
+        <w:spacing w:after="160" w:line="276"/>
+        <w:jc w:val="both"/>
+      </w:pPr>
+      <w:r>
+        <w:rPr>
+          <w:sz w:val="22"/>
+          <w:szCs w:val="22"/>
+        </w:rPr>
+        <w:t xml:space="preserve">Merece una nota el filtro empleado, porque el primer intento no registró ni un paquete. Lo natural es filtrar por el nombre del sitio, </w:t>
+      </w:r>
+      <w:r>
+        <w:rPr>
+          <w:rFonts w:ascii="Consolas" w:cs="Consolas" w:eastAsia="Consolas" w:hAnsi="Consolas"/>
+          <w:sz w:val="20"/>
+          <w:szCs w:val="20"/>
+        </w:rPr>
+        <w:t xml:space="preserve">host santafe-pineda.shop</w:t>
+      </w:r>
+      <w:r>
+        <w:rPr>
+          <w:sz w:val="22"/>
+          <w:szCs w:val="22"/>
+        </w:rPr>
+        <w:t xml:space="preserve">, pero en una instancia de AWS eso no funciona: el nombre resuelve a la dirección elástica, mientras que la pasarela de la nube traduce las direcciones y los paquetes llegan a la interfaz de la máquina dirigidos a su IP privada. El filtro no coincide con nada y la captura sale vacía sin dar ninguna pista del motivo. Basta con filtrar por el puerto. Por lo mismo se graba a un archivo en lugar de encadenar tcpdump con grep: al escribir hacia una tubería, tcpdump acumula la salida antes de entregarla y en pantalla parece que no captura nada.</w:t>
       </w:r>
     </w:p>
     <w:p>

</xml_diff>

<commit_message>
SSL: incorporar al informe las 18 capturas de la practica
Se extraen del PDF exportado desde Word las capturas tomadas durante la
ejecucion, se guardan en deploy/evidencias/ con nombres estables y se embeben
en el .docx en el apartado que les corresponde, cada una con un pie que explica
que prueba. El generador escala cada imagen al ancho util de la pagina y lee
sus dimensiones de la cabecera, de modo que el documento se reconstruye sin
intervencion manual.

Seis de las capturas resultaron ser JPEG pese a la extension con que salieron
del PDF; se corrige, porque el tipo hay que declararlo al insertarlas.

Quedan tres recuadros pendientes -temporizador de certbot, redireccion 301 y
SSL Labs con el certificado definitivo-, con la orden concreta para obtener
cada uno.

Co-Authored-By: Claude Opus 5 <noreply@anthropic.com>
</commit_message>
<xml_diff>
--- a/Taller/Taller-cifrado/docs/pineda-juan-ssl.docx
+++ b/Taller/Taller-cifrado/docs/pineda-juan-ssl.docx
@@ -872,6 +872,68 @@
     </w:p>
     <w:p>
       <w:pPr>
+        <w:spacing w:after="60" w:before="160"/>
+        <w:jc w:val="center"/>
+      </w:pPr>
+      <w:r>
+        <w:drawing>
+          <wp:inline distT="0" distB="0" distL="0" distR="0">
+            <wp:extent cx="5905500" cy="3714750"/>
+            <wp:effectExtent t="0" r="0" b="0" l="0"/>
+            <wp:docPr id="1" name="" descr="" title=""/>
+            <wp:cNvGraphicFramePr>
+              <a:graphicFrameLocks xmlns:a="http://schemas.openxmlformats.org/drawingml/2006/main" noChangeAspect="1"/>
+            </wp:cNvGraphicFramePr>
+            <a:graphic xmlns:a="http://schemas.openxmlformats.org/drawingml/2006/main">
+              <a:graphicData uri="http://schemas.openxmlformats.org/drawingml/2006/picture">
+                <pic:pic xmlns:pic="http://schemas.openxmlformats.org/drawingml/2006/picture">
+                  <pic:nvPicPr>
+                    <pic:cNvPr id="0" name="" descr=""/>
+                    <pic:cNvPicPr>
+                      <a:picLocks noChangeAspect="1" noChangeArrowheads="1"/>
+                    </pic:cNvPicPr>
+                  </pic:nvPicPr>
+                  <pic:blipFill>
+                    <a:blip r:embed="rId8" cstate="none"/>
+                    <a:srcRect/>
+                    <a:stretch>
+                      <a:fillRect/>
+                    </a:stretch>
+                  </pic:blipFill>
+                  <pic:spPr bwMode="auto">
+                    <a:xfrm>
+                      <a:off x="0" y="0"/>
+                      <a:ext cx="5905500" cy="3714750"/>
+                    </a:xfrm>
+                    <a:prstGeom prst="rect">
+                      <a:avLst/>
+                    </a:prstGeom>
+                  </pic:spPr>
+                </pic:pic>
+              </a:graphicData>
+            </a:graphic>
+          </wp:inline>
+        </w:drawing>
+      </w:r>
+    </w:p>
+    <w:p>
+      <w:pPr>
+        <w:spacing w:after="240"/>
+        <w:jc w:val="center"/>
+      </w:pPr>
+      <w:r>
+        <w:rPr>
+          <w:i/>
+          <w:iCs/>
+          <w:color w:val="555555"/>
+          <w:sz w:val="18"/>
+          <w:szCs w:val="18"/>
+        </w:rPr>
+        <w:t xml:space="preserve">Figura 1. Acceso por SSH a la instancia EC2. Ubuntu 24.04 LTS sobre AWS, con direccion privada 172.31.22.193 detras de la IP elastica publica.</w:t>
+      </w:r>
+    </w:p>
+    <w:p>
+      <w:pPr>
         <w:spacing w:after="160" w:line="276"/>
         <w:jc w:val="both"/>
       </w:pPr>
@@ -1107,6 +1169,68 @@
     </w:p>
     <w:p>
       <w:pPr>
+        <w:spacing w:after="60" w:before="160"/>
+        <w:jc w:val="center"/>
+      </w:pPr>
+      <w:r>
+        <w:drawing>
+          <wp:inline distT="0" distB="0" distL="0" distR="0">
+            <wp:extent cx="5905500" cy="4752975"/>
+            <wp:effectExtent t="0" r="0" b="0" l="0"/>
+            <wp:docPr id="1" name="" descr="" title=""/>
+            <wp:cNvGraphicFramePr>
+              <a:graphicFrameLocks xmlns:a="http://schemas.openxmlformats.org/drawingml/2006/main" noChangeAspect="1"/>
+            </wp:cNvGraphicFramePr>
+            <a:graphic xmlns:a="http://schemas.openxmlformats.org/drawingml/2006/main">
+              <a:graphicData uri="http://schemas.openxmlformats.org/drawingml/2006/picture">
+                <pic:pic xmlns:pic="http://schemas.openxmlformats.org/drawingml/2006/picture">
+                  <pic:nvPicPr>
+                    <pic:cNvPr id="0" name="" descr=""/>
+                    <pic:cNvPicPr>
+                      <a:picLocks noChangeAspect="1" noChangeArrowheads="1"/>
+                    </pic:cNvPicPr>
+                  </pic:nvPicPr>
+                  <pic:blipFill>
+                    <a:blip r:embed="rId9" cstate="none"/>
+                    <a:srcRect/>
+                    <a:stretch>
+                      <a:fillRect/>
+                    </a:stretch>
+                  </pic:blipFill>
+                  <pic:spPr bwMode="auto">
+                    <a:xfrm>
+                      <a:off x="0" y="0"/>
+                      <a:ext cx="5905500" cy="4752975"/>
+                    </a:xfrm>
+                    <a:prstGeom prst="rect">
+                      <a:avLst/>
+                    </a:prstGeom>
+                  </pic:spPr>
+                </pic:pic>
+              </a:graphicData>
+            </a:graphic>
+          </wp:inline>
+        </w:drawing>
+      </w:r>
+    </w:p>
+    <w:p>
+      <w:pPr>
+        <w:spacing w:after="240"/>
+        <w:jc w:val="center"/>
+      </w:pPr>
+      <w:r>
+        <w:rPr>
+          <w:i/>
+          <w:iCs/>
+          <w:color w:val="555555"/>
+          <w:sz w:val="18"/>
+          <w:szCs w:val="18"/>
+        </w:rPr>
+        <w:t xml:space="preserve">Figura 2. El sitio respondiendo por HTTP sin cifrar. El 502 inicial corresponde al instante en que el servicio se reiniciaba; acto seguido responde 200 OK, sin redireccion, que es el punto de partida de la practica.</w:t>
+      </w:r>
+    </w:p>
+    <w:p>
+      <w:pPr>
         <w:spacing w:after="160" w:line="276"/>
         <w:jc w:val="both"/>
       </w:pPr>
@@ -1355,72 +1479,130 @@
         <w:t xml:space="preserve">Una prueba con SSL Labs en esta etapa no produce calificación alguna, sino el mensaje "Assessment failed: No secure protocols supported", que es la forma que tiene la herramienta de decir que no hay nada que evaluar porque el puerto 443 ni siquiera responde.</w:t>
       </w:r>
     </w:p>
-    <w:tbl>
-      <w:tblPr>
-        <w:tblW w:type="dxa" w:w="9360"/>
-        <w:tblBorders>
-          <w:top w:val="single" w:color="auto" w:sz="4"/>
-          <w:left w:val="single" w:color="auto" w:sz="4"/>
-          <w:bottom w:val="single" w:color="auto" w:sz="4"/>
-          <w:right w:val="single" w:color="auto" w:sz="4"/>
-          <w:insideH w:val="single" w:color="auto" w:sz="4"/>
-          <w:insideV w:val="single" w:color="auto" w:sz="4"/>
-        </w:tblBorders>
-      </w:tblPr>
-      <w:tblGrid>
-        <w:gridCol w:w="9360"/>
-      </w:tblGrid>
-      <w:tr>
-        <w:tc>
-          <w:tcPr>
-            <w:tcW w:type="dxa" w:w="9360"/>
-            <w:tcBorders>
-              <w:top w:val="dashed" w:color="D9A441" w:sz="6"/>
-              <w:left w:val="dashed" w:color="D9A441" w:sz="6"/>
-              <w:bottom w:val="dashed" w:color="D9A441" w:sz="6"/>
-              <w:right w:val="dashed" w:color="D9A441" w:sz="6"/>
-            </w:tcBorders>
-            <w:shd w:fill="FFF7E6" w:color="auto" w:val="clear"/>
-            <w:tcMar>
-              <w:top w:type="dxa" w:w="160"/>
-              <w:left w:type="dxa" w:w="160"/>
-              <w:bottom w:type="dxa" w:w="160"/>
-              <w:right w:type="dxa" w:w="160"/>
-            </w:tcMar>
-          </w:tcPr>
-          <w:p>
-            <w:pPr>
-              <w:spacing w:after="60"/>
-            </w:pPr>
-            <w:r>
-              <w:rPr>
-                <w:b/>
-                <w:bCs/>
-                <w:color w:val="8A5A00"/>
-                <w:sz w:val="20"/>
-                <w:szCs w:val="20"/>
-              </w:rPr>
-              <w:t xml:space="preserve">INSERTAR CAPTURA  ·  01-sin-ssl-firefox.png</w:t>
-            </w:r>
-          </w:p>
-          <w:p>
-            <w:pPr>
-              <w:spacing w:after="0"/>
-            </w:pPr>
-            <w:r>
-              <w:rPr>
-                <w:i/>
-                <w:iCs/>
-                <w:color w:val="6B4A00"/>
-                <w:sz w:val="20"/>
-                <w:szCs w:val="20"/>
-              </w:rPr>
-              <w:t xml:space="preserve">Firefox en http://santafe-pineda.shop/login con el candado tachado y el aviso "Esta conexión no es segura" sobre el campo de contraseña.</w:t>
-            </w:r>
-          </w:p>
-        </w:tc>
-      </w:tr>
-    </w:tbl>
+    <w:p>
+      <w:pPr>
+        <w:spacing w:after="60" w:before="160"/>
+        <w:jc w:val="center"/>
+      </w:pPr>
+      <w:r>
+        <w:drawing>
+          <wp:inline distT="0" distB="0" distL="0" distR="0">
+            <wp:extent cx="5905500" cy="3324225"/>
+            <wp:effectExtent t="0" r="0" b="0" l="0"/>
+            <wp:docPr id="1" name="" descr="" title=""/>
+            <wp:cNvGraphicFramePr>
+              <a:graphicFrameLocks xmlns:a="http://schemas.openxmlformats.org/drawingml/2006/main" noChangeAspect="1"/>
+            </wp:cNvGraphicFramePr>
+            <a:graphic xmlns:a="http://schemas.openxmlformats.org/drawingml/2006/main">
+              <a:graphicData uri="http://schemas.openxmlformats.org/drawingml/2006/picture">
+                <pic:pic xmlns:pic="http://schemas.openxmlformats.org/drawingml/2006/picture">
+                  <pic:nvPicPr>
+                    <pic:cNvPr id="0" name="" descr=""/>
+                    <pic:cNvPicPr>
+                      <a:picLocks noChangeAspect="1" noChangeArrowheads="1"/>
+                    </pic:cNvPicPr>
+                  </pic:nvPicPr>
+                  <pic:blipFill>
+                    <a:blip r:embed="rId10" cstate="none"/>
+                    <a:srcRect/>
+                    <a:stretch>
+                      <a:fillRect/>
+                    </a:stretch>
+                  </pic:blipFill>
+                  <pic:spPr bwMode="auto">
+                    <a:xfrm>
+                      <a:off x="0" y="0"/>
+                      <a:ext cx="5905500" cy="3324225"/>
+                    </a:xfrm>
+                    <a:prstGeom prst="rect">
+                      <a:avLst/>
+                    </a:prstGeom>
+                  </pic:spPr>
+                </pic:pic>
+              </a:graphicData>
+            </a:graphic>
+          </wp:inline>
+        </w:drawing>
+      </w:r>
+    </w:p>
+    <w:p>
+      <w:pPr>
+        <w:spacing w:after="240"/>
+        <w:jc w:val="center"/>
+      </w:pPr>
+      <w:r>
+        <w:rPr>
+          <w:i/>
+          <w:iCs/>
+          <w:color w:val="555555"/>
+          <w:sz w:val="18"/>
+          <w:szCs w:val="18"/>
+        </w:rPr>
+        <w:t xml:space="preserve">Figura 3. El navegador marca el sitio como "Not secure" y advierte de que no deben introducirse contrasenas en el. El formulario de inicio de sesion se sirve por HTTP.</w:t>
+      </w:r>
+    </w:p>
+    <w:p>
+      <w:pPr>
+        <w:spacing w:after="60" w:before="160"/>
+        <w:jc w:val="center"/>
+      </w:pPr>
+      <w:r>
+        <w:drawing>
+          <wp:inline distT="0" distB="0" distL="0" distR="0">
+            <wp:extent cx="5905500" cy="3324225"/>
+            <wp:effectExtent t="0" r="0" b="0" l="0"/>
+            <wp:docPr id="1" name="" descr="" title=""/>
+            <wp:cNvGraphicFramePr>
+              <a:graphicFrameLocks xmlns:a="http://schemas.openxmlformats.org/drawingml/2006/main" noChangeAspect="1"/>
+            </wp:cNvGraphicFramePr>
+            <a:graphic xmlns:a="http://schemas.openxmlformats.org/drawingml/2006/main">
+              <a:graphicData uri="http://schemas.openxmlformats.org/drawingml/2006/picture">
+                <pic:pic xmlns:pic="http://schemas.openxmlformats.org/drawingml/2006/picture">
+                  <pic:nvPicPr>
+                    <pic:cNvPr id="0" name="" descr=""/>
+                    <pic:cNvPicPr>
+                      <a:picLocks noChangeAspect="1" noChangeArrowheads="1"/>
+                    </pic:cNvPicPr>
+                  </pic:nvPicPr>
+                  <pic:blipFill>
+                    <a:blip r:embed="rId11" cstate="none"/>
+                    <a:srcRect/>
+                    <a:stretch>
+                      <a:fillRect/>
+                    </a:stretch>
+                  </pic:blipFill>
+                  <pic:spPr bwMode="auto">
+                    <a:xfrm>
+                      <a:off x="0" y="0"/>
+                      <a:ext cx="5905500" cy="3324225"/>
+                    </a:xfrm>
+                    <a:prstGeom prst="rect">
+                      <a:avLst/>
+                    </a:prstGeom>
+                  </pic:spPr>
+                </pic:pic>
+              </a:graphicData>
+            </a:graphic>
+          </wp:inline>
+        </w:drawing>
+      </w:r>
+    </w:p>
+    <w:p>
+      <w:pPr>
+        <w:spacing w:after="240"/>
+        <w:jc w:val="center"/>
+      </w:pPr>
+      <w:r>
+        <w:rPr>
+          <w:i/>
+          <w:iCs/>
+          <w:color w:val="555555"/>
+          <w:sz w:val="18"/>
+          <w:szCs w:val="18"/>
+        </w:rPr>
+        <w:t xml:space="preserve">Figura 4. La aplicacion completa, con el panel de usuarios y los hashes BCrypt, viaja tambien en claro.</w:t>
+      </w:r>
+    </w:p>
     <w:p>
       <w:pPr>
         <w:spacing w:after="0"/>
@@ -1433,72 +1615,68 @@
         <w:t xml:space="preserve"/>
       </w:r>
     </w:p>
-    <w:tbl>
-      <w:tblPr>
-        <w:tblW w:type="dxa" w:w="9360"/>
-        <w:tblBorders>
-          <w:top w:val="single" w:color="auto" w:sz="4"/>
-          <w:left w:val="single" w:color="auto" w:sz="4"/>
-          <w:bottom w:val="single" w:color="auto" w:sz="4"/>
-          <w:right w:val="single" w:color="auto" w:sz="4"/>
-          <w:insideH w:val="single" w:color="auto" w:sz="4"/>
-          <w:insideV w:val="single" w:color="auto" w:sz="4"/>
-        </w:tblBorders>
-      </w:tblPr>
-      <w:tblGrid>
-        <w:gridCol w:w="9360"/>
-      </w:tblGrid>
-      <w:tr>
-        <w:tc>
-          <w:tcPr>
-            <w:tcW w:type="dxa" w:w="9360"/>
-            <w:tcBorders>
-              <w:top w:val="dashed" w:color="D9A441" w:sz="6"/>
-              <w:left w:val="dashed" w:color="D9A441" w:sz="6"/>
-              <w:bottom w:val="dashed" w:color="D9A441" w:sz="6"/>
-              <w:right w:val="dashed" w:color="D9A441" w:sz="6"/>
-            </w:tcBorders>
-            <w:shd w:fill="FFF7E6" w:color="auto" w:val="clear"/>
-            <w:tcMar>
-              <w:top w:type="dxa" w:w="160"/>
-              <w:left w:type="dxa" w:w="160"/>
-              <w:bottom w:type="dxa" w:w="160"/>
-              <w:right w:type="dxa" w:w="160"/>
-            </w:tcMar>
-          </w:tcPr>
-          <w:p>
-            <w:pPr>
-              <w:spacing w:after="60"/>
-            </w:pPr>
-            <w:r>
-              <w:rPr>
-                <w:b/>
-                <w:bCs/>
-                <w:color w:val="8A5A00"/>
-                <w:sz w:val="20"/>
-                <w:szCs w:val="20"/>
-              </w:rPr>
-              <w:t xml:space="preserve">INSERTAR CAPTURA  ·  02-sin-ssl-captura-red.png</w:t>
-            </w:r>
-          </w:p>
-          <w:p>
-            <w:pPr>
-              <w:spacing w:after="0"/>
-            </w:pPr>
-            <w:r>
-              <w:rPr>
-                <w:i/>
-                <w:iCs/>
-                <w:color w:val="6B4A00"/>
-                <w:sz w:val="20"/>
-                <w:szCs w:val="20"/>
-              </w:rPr>
-              <w:t xml:space="preserve">Salida de tcpdump durante un inicio de sesión: el usuario y la contraseña legibles en texto plano.</w:t>
-            </w:r>
-          </w:p>
-        </w:tc>
-      </w:tr>
-    </w:tbl>
+    <w:p>
+      <w:pPr>
+        <w:spacing w:after="60" w:before="160"/>
+        <w:jc w:val="center"/>
+      </w:pPr>
+      <w:r>
+        <w:drawing>
+          <wp:inline distT="0" distB="0" distL="0" distR="0">
+            <wp:extent cx="5905500" cy="4524375"/>
+            <wp:effectExtent t="0" r="0" b="0" l="0"/>
+            <wp:docPr id="1" name="" descr="" title=""/>
+            <wp:cNvGraphicFramePr>
+              <a:graphicFrameLocks xmlns:a="http://schemas.openxmlformats.org/drawingml/2006/main" noChangeAspect="1"/>
+            </wp:cNvGraphicFramePr>
+            <a:graphic xmlns:a="http://schemas.openxmlformats.org/drawingml/2006/main">
+              <a:graphicData uri="http://schemas.openxmlformats.org/drawingml/2006/picture">
+                <pic:pic xmlns:pic="http://schemas.openxmlformats.org/drawingml/2006/picture">
+                  <pic:nvPicPr>
+                    <pic:cNvPr id="0" name="" descr=""/>
+                    <pic:cNvPicPr>
+                      <a:picLocks noChangeAspect="1" noChangeArrowheads="1"/>
+                    </pic:cNvPicPr>
+                  </pic:nvPicPr>
+                  <pic:blipFill>
+                    <a:blip r:embed="rId12" cstate="none"/>
+                    <a:srcRect/>
+                    <a:stretch>
+                      <a:fillRect/>
+                    </a:stretch>
+                  </pic:blipFill>
+                  <pic:spPr bwMode="auto">
+                    <a:xfrm>
+                      <a:off x="0" y="0"/>
+                      <a:ext cx="5905500" cy="4524375"/>
+                    </a:xfrm>
+                    <a:prstGeom prst="rect">
+                      <a:avLst/>
+                    </a:prstGeom>
+                  </pic:spPr>
+                </pic:pic>
+              </a:graphicData>
+            </a:graphic>
+          </wp:inline>
+        </w:drawing>
+      </w:r>
+    </w:p>
+    <w:p>
+      <w:pPr>
+        <w:spacing w:after="240"/>
+        <w:jc w:val="center"/>
+      </w:pPr>
+      <w:r>
+        <w:rPr>
+          <w:i/>
+          <w:iCs/>
+          <w:color w:val="555555"/>
+          <w:sz w:val="18"/>
+          <w:szCs w:val="18"/>
+        </w:rPr>
+        <w:t xml:space="preserve">Figura 5. Captura del trafico durante un inicio de sesion real. En el cuerpo del POST se lee {"username":"admin","password":"Admin2026*"}: la contrasena viaja intacta por la red.</w:t>
+      </w:r>
+    </w:p>
     <w:p>
       <w:pPr>
         <w:spacing w:after="0"/>
@@ -1511,72 +1689,68 @@
         <w:t xml:space="preserve"/>
       </w:r>
     </w:p>
-    <w:tbl>
-      <w:tblPr>
-        <w:tblW w:type="dxa" w:w="9360"/>
-        <w:tblBorders>
-          <w:top w:val="single" w:color="auto" w:sz="4"/>
-          <w:left w:val="single" w:color="auto" w:sz="4"/>
-          <w:bottom w:val="single" w:color="auto" w:sz="4"/>
-          <w:right w:val="single" w:color="auto" w:sz="4"/>
-          <w:insideH w:val="single" w:color="auto" w:sz="4"/>
-          <w:insideV w:val="single" w:color="auto" w:sz="4"/>
-        </w:tblBorders>
-      </w:tblPr>
-      <w:tblGrid>
-        <w:gridCol w:w="9360"/>
-      </w:tblGrid>
-      <w:tr>
-        <w:tc>
-          <w:tcPr>
-            <w:tcW w:type="dxa" w:w="9360"/>
-            <w:tcBorders>
-              <w:top w:val="dashed" w:color="D9A441" w:sz="6"/>
-              <w:left w:val="dashed" w:color="D9A441" w:sz="6"/>
-              <w:bottom w:val="dashed" w:color="D9A441" w:sz="6"/>
-              <w:right w:val="dashed" w:color="D9A441" w:sz="6"/>
-            </w:tcBorders>
-            <w:shd w:fill="FFF7E6" w:color="auto" w:val="clear"/>
-            <w:tcMar>
-              <w:top w:type="dxa" w:w="160"/>
-              <w:left w:type="dxa" w:w="160"/>
-              <w:bottom w:type="dxa" w:w="160"/>
-              <w:right w:type="dxa" w:w="160"/>
-            </w:tcMar>
-          </w:tcPr>
-          <w:p>
-            <w:pPr>
-              <w:spacing w:after="60"/>
-            </w:pPr>
-            <w:r>
-              <w:rPr>
-                <w:b/>
-                <w:bCs/>
-                <w:color w:val="8A5A00"/>
-                <w:sz w:val="20"/>
-                <w:szCs w:val="20"/>
-              </w:rPr>
-              <w:t xml:space="preserve">INSERTAR CAPTURA  ·  03-sin-ssl-ssllabs.png</w:t>
-            </w:r>
-          </w:p>
-          <w:p>
-            <w:pPr>
-              <w:spacing w:after="0"/>
-            </w:pPr>
-            <w:r>
-              <w:rPr>
-                <w:i/>
-                <w:iCs/>
-                <w:color w:val="6B4A00"/>
-                <w:sz w:val="20"/>
-                <w:szCs w:val="20"/>
-              </w:rPr>
-              <w:t xml:space="preserve">SSL Labs sobre el dominio: "Assessment failed: No secure protocols supported".</w:t>
-            </w:r>
-          </w:p>
-        </w:tc>
-      </w:tr>
-    </w:tbl>
+    <w:p>
+      <w:pPr>
+        <w:spacing w:after="60" w:before="160"/>
+        <w:jc w:val="center"/>
+      </w:pPr>
+      <w:r>
+        <w:drawing>
+          <wp:inline distT="0" distB="0" distL="0" distR="0">
+            <wp:extent cx="5905500" cy="3324225"/>
+            <wp:effectExtent t="0" r="0" b="0" l="0"/>
+            <wp:docPr id="1" name="" descr="" title=""/>
+            <wp:cNvGraphicFramePr>
+              <a:graphicFrameLocks xmlns:a="http://schemas.openxmlformats.org/drawingml/2006/main" noChangeAspect="1"/>
+            </wp:cNvGraphicFramePr>
+            <a:graphic xmlns:a="http://schemas.openxmlformats.org/drawingml/2006/main">
+              <a:graphicData uri="http://schemas.openxmlformats.org/drawingml/2006/picture">
+                <pic:pic xmlns:pic="http://schemas.openxmlformats.org/drawingml/2006/picture">
+                  <pic:nvPicPr>
+                    <pic:cNvPr id="0" name="" descr=""/>
+                    <pic:cNvPicPr>
+                      <a:picLocks noChangeAspect="1" noChangeArrowheads="1"/>
+                    </pic:cNvPicPr>
+                  </pic:nvPicPr>
+                  <pic:blipFill>
+                    <a:blip r:embed="rId13" cstate="none"/>
+                    <a:srcRect/>
+                    <a:stretch>
+                      <a:fillRect/>
+                    </a:stretch>
+                  </pic:blipFill>
+                  <pic:spPr bwMode="auto">
+                    <a:xfrm>
+                      <a:off x="0" y="0"/>
+                      <a:ext cx="5905500" cy="3324225"/>
+                    </a:xfrm>
+                    <a:prstGeom prst="rect">
+                      <a:avLst/>
+                    </a:prstGeom>
+                  </pic:spPr>
+                </pic:pic>
+              </a:graphicData>
+            </a:graphic>
+          </wp:inline>
+        </w:drawing>
+      </w:r>
+    </w:p>
+    <w:p>
+      <w:pPr>
+        <w:spacing w:after="240"/>
+        <w:jc w:val="center"/>
+      </w:pPr>
+      <w:r>
+        <w:rPr>
+          <w:i/>
+          <w:iCs/>
+          <w:color w:val="555555"/>
+          <w:sz w:val="18"/>
+          <w:szCs w:val="18"/>
+        </w:rPr>
+        <w:t xml:space="preserve">Figura 6. SSL Labs no llega a emitir calificacion: "Assessment failed: Unable to connect to the server". No hay nada que evaluar porque el puerto 443 no responde.</w:t>
+      </w:r>
+    </w:p>
     <w:p>
       <w:r>
         <w:br w:type="page"/>
@@ -2974,72 +3148,130 @@
         <w:t xml:space="preserve">El problema práctico es que ningún visitante debería acostumbrarse a pulsar "Aceptar el riesgo y continuar". Esa costumbre es justamente lo que un ataque de intermediario necesita para pasar inadvertido, porque el certificado falso del atacante produce en el navegador una advertencia idéntica a la que el usuario ya aprendió a ignorar. Por eso el certificado autofirmado sirve para entornos internos y pruebas, pero no para un sitio público.</w:t>
       </w:r>
     </w:p>
-    <w:tbl>
-      <w:tblPr>
-        <w:tblW w:type="dxa" w:w="9360"/>
-        <w:tblBorders>
-          <w:top w:val="single" w:color="auto" w:sz="4"/>
-          <w:left w:val="single" w:color="auto" w:sz="4"/>
-          <w:bottom w:val="single" w:color="auto" w:sz="4"/>
-          <w:right w:val="single" w:color="auto" w:sz="4"/>
-          <w:insideH w:val="single" w:color="auto" w:sz="4"/>
-          <w:insideV w:val="single" w:color="auto" w:sz="4"/>
-        </w:tblBorders>
-      </w:tblPr>
-      <w:tblGrid>
-        <w:gridCol w:w="9360"/>
-      </w:tblGrid>
-      <w:tr>
-        <w:tc>
-          <w:tcPr>
-            <w:tcW w:type="dxa" w:w="9360"/>
-            <w:tcBorders>
-              <w:top w:val="dashed" w:color="D9A441" w:sz="6"/>
-              <w:left w:val="dashed" w:color="D9A441" w:sz="6"/>
-              <w:bottom w:val="dashed" w:color="D9A441" w:sz="6"/>
-              <w:right w:val="dashed" w:color="D9A441" w:sz="6"/>
-            </w:tcBorders>
-            <w:shd w:fill="FFF7E6" w:color="auto" w:val="clear"/>
-            <w:tcMar>
-              <w:top w:type="dxa" w:w="160"/>
-              <w:left w:type="dxa" w:w="160"/>
-              <w:bottom w:type="dxa" w:w="160"/>
-              <w:right w:type="dxa" w:w="160"/>
-            </w:tcMar>
-          </w:tcPr>
-          <w:p>
-            <w:pPr>
-              <w:spacing w:after="60"/>
-            </w:pPr>
-            <w:r>
-              <w:rPr>
-                <w:b/>
-                <w:bCs/>
-                <w:color w:val="8A5A00"/>
-                <w:sz w:val="20"/>
-                <w:szCs w:val="20"/>
-              </w:rPr>
-              <w:t xml:space="preserve">INSERTAR CAPTURA  ·  04-openssl-generacion.png</w:t>
-            </w:r>
-          </w:p>
-          <w:p>
-            <w:pPr>
-              <w:spacing w:after="0"/>
-            </w:pPr>
-            <w:r>
-              <w:rPr>
-                <w:i/>
-                <w:iCs/>
-                <w:color w:val="6B4A00"/>
-                <w:sz w:val="20"/>
-                <w:szCs w:val="20"/>
-              </w:rPr>
-              <w:t xml:space="preserve">Salida completa de los tres pasos de OpenSSL: generación de la llave, la CSR y la autofirma.</w:t>
-            </w:r>
-          </w:p>
-        </w:tc>
-      </w:tr>
-    </w:tbl>
+    <w:p>
+      <w:pPr>
+        <w:spacing w:after="60" w:before="160"/>
+        <w:jc w:val="center"/>
+      </w:pPr>
+      <w:r>
+        <w:drawing>
+          <wp:inline distT="0" distB="0" distL="0" distR="0">
+            <wp:extent cx="5905500" cy="4543425"/>
+            <wp:effectExtent t="0" r="0" b="0" l="0"/>
+            <wp:docPr id="1" name="" descr="" title=""/>
+            <wp:cNvGraphicFramePr>
+              <a:graphicFrameLocks xmlns:a="http://schemas.openxmlformats.org/drawingml/2006/main" noChangeAspect="1"/>
+            </wp:cNvGraphicFramePr>
+            <a:graphic xmlns:a="http://schemas.openxmlformats.org/drawingml/2006/main">
+              <a:graphicData uri="http://schemas.openxmlformats.org/drawingml/2006/picture">
+                <pic:pic xmlns:pic="http://schemas.openxmlformats.org/drawingml/2006/picture">
+                  <pic:nvPicPr>
+                    <pic:cNvPr id="0" name="" descr=""/>
+                    <pic:cNvPicPr>
+                      <a:picLocks noChangeAspect="1" noChangeArrowheads="1"/>
+                    </pic:cNvPicPr>
+                  </pic:nvPicPr>
+                  <pic:blipFill>
+                    <a:blip r:embed="rId14" cstate="none"/>
+                    <a:srcRect/>
+                    <a:stretch>
+                      <a:fillRect/>
+                    </a:stretch>
+                  </pic:blipFill>
+                  <pic:spPr bwMode="auto">
+                    <a:xfrm>
+                      <a:off x="0" y="0"/>
+                      <a:ext cx="5905500" cy="4543425"/>
+                    </a:xfrm>
+                    <a:prstGeom prst="rect">
+                      <a:avLst/>
+                    </a:prstGeom>
+                  </pic:spPr>
+                </pic:pic>
+              </a:graphicData>
+            </a:graphic>
+          </wp:inline>
+        </w:drawing>
+      </w:r>
+    </w:p>
+    <w:p>
+      <w:pPr>
+        <w:spacing w:after="240"/>
+        <w:jc w:val="center"/>
+      </w:pPr>
+      <w:r>
+        <w:rPr>
+          <w:i/>
+          <w:iCs/>
+          <w:color w:val="555555"/>
+          <w:sz w:val="18"/>
+          <w:szCs w:val="18"/>
+        </w:rPr>
+        <w:t xml:space="preserve">Figura 7. Final del guion de generacion: verificacion del certificado y relacion de los cuatro archivos creados, con la ruta de cada uno.</w:t>
+      </w:r>
+    </w:p>
+    <w:p>
+      <w:pPr>
+        <w:spacing w:after="60" w:before="160"/>
+        <w:jc w:val="center"/>
+      </w:pPr>
+      <w:r>
+        <w:drawing>
+          <wp:inline distT="0" distB="0" distL="0" distR="0">
+            <wp:extent cx="5905500" cy="1485900"/>
+            <wp:effectExtent t="0" r="0" b="0" l="0"/>
+            <wp:docPr id="1" name="" descr="" title=""/>
+            <wp:cNvGraphicFramePr>
+              <a:graphicFrameLocks xmlns:a="http://schemas.openxmlformats.org/drawingml/2006/main" noChangeAspect="1"/>
+            </wp:cNvGraphicFramePr>
+            <a:graphic xmlns:a="http://schemas.openxmlformats.org/drawingml/2006/main">
+              <a:graphicData uri="http://schemas.openxmlformats.org/drawingml/2006/picture">
+                <pic:pic xmlns:pic="http://schemas.openxmlformats.org/drawingml/2006/picture">
+                  <pic:nvPicPr>
+                    <pic:cNvPr id="0" name="" descr=""/>
+                    <pic:cNvPicPr>
+                      <a:picLocks noChangeAspect="1" noChangeArrowheads="1"/>
+                    </pic:cNvPicPr>
+                  </pic:nvPicPr>
+                  <pic:blipFill>
+                    <a:blip r:embed="rId15" cstate="none"/>
+                    <a:srcRect/>
+                    <a:stretch>
+                      <a:fillRect/>
+                    </a:stretch>
+                  </pic:blipFill>
+                  <pic:spPr bwMode="auto">
+                    <a:xfrm>
+                      <a:off x="0" y="0"/>
+                      <a:ext cx="5905500" cy="1485900"/>
+                    </a:xfrm>
+                    <a:prstGeom prst="rect">
+                      <a:avLst/>
+                    </a:prstGeom>
+                  </pic:spPr>
+                </pic:pic>
+              </a:graphicData>
+            </a:graphic>
+          </wp:inline>
+        </w:drawing>
+      </w:r>
+    </w:p>
+    <w:p>
+      <w:pPr>
+        <w:spacing w:after="240"/>
+        <w:jc w:val="center"/>
+      </w:pPr>
+      <w:r>
+        <w:rPr>
+          <w:i/>
+          <w:iCs/>
+          <w:color w:val="555555"/>
+          <w:sz w:val="18"/>
+          <w:szCs w:val="18"/>
+        </w:rPr>
+        <w:t xml:space="preserve">Figura 8. Titular y emisor del certificado autofirmado. Ambos campos contienen el mismo nombre: esa coincidencia es la problematica asociada.</w:t>
+      </w:r>
+    </w:p>
     <w:p>
       <w:pPr>
         <w:spacing w:after="0"/>
@@ -3052,72 +3284,68 @@
         <w:t xml:space="preserve"/>
       </w:r>
     </w:p>
-    <w:tbl>
-      <w:tblPr>
-        <w:tblW w:type="dxa" w:w="9360"/>
-        <w:tblBorders>
-          <w:top w:val="single" w:color="auto" w:sz="4"/>
-          <w:left w:val="single" w:color="auto" w:sz="4"/>
-          <w:bottom w:val="single" w:color="auto" w:sz="4"/>
-          <w:right w:val="single" w:color="auto" w:sz="4"/>
-          <w:insideH w:val="single" w:color="auto" w:sz="4"/>
-          <w:insideV w:val="single" w:color="auto" w:sz="4"/>
-        </w:tblBorders>
-      </w:tblPr>
-      <w:tblGrid>
-        <w:gridCol w:w="9360"/>
-      </w:tblGrid>
-      <w:tr>
-        <w:tc>
-          <w:tcPr>
-            <w:tcW w:type="dxa" w:w="9360"/>
-            <w:tcBorders>
-              <w:top w:val="dashed" w:color="D9A441" w:sz="6"/>
-              <w:left w:val="dashed" w:color="D9A441" w:sz="6"/>
-              <w:bottom w:val="dashed" w:color="D9A441" w:sz="6"/>
-              <w:right w:val="dashed" w:color="D9A441" w:sz="6"/>
-            </w:tcBorders>
-            <w:shd w:fill="FFF7E6" w:color="auto" w:val="clear"/>
-            <w:tcMar>
-              <w:top w:type="dxa" w:w="160"/>
-              <w:left w:type="dxa" w:w="160"/>
-              <w:bottom w:type="dxa" w:w="160"/>
-              <w:right w:type="dxa" w:w="160"/>
-            </w:tcMar>
-          </w:tcPr>
-          <w:p>
-            <w:pPr>
-              <w:spacing w:after="60"/>
-            </w:pPr>
-            <w:r>
-              <w:rPr>
-                <w:b/>
-                <w:bCs/>
-                <w:color w:val="8A5A00"/>
-                <w:sz w:val="20"/>
-                <w:szCs w:val="20"/>
-              </w:rPr>
-              <w:t xml:space="preserve">INSERTAR CAPTURA  ·  05-autofirmado-advertencia.png</w:t>
-            </w:r>
-          </w:p>
-          <w:p>
-            <w:pPr>
-              <w:spacing w:after="0"/>
-            </w:pPr>
-            <w:r>
-              <w:rPr>
-                <w:i/>
-                <w:iCs/>
-                <w:color w:val="6B4A00"/>
-                <w:sz w:val="20"/>
-                <w:szCs w:val="20"/>
-              </w:rPr>
-              <w:t xml:space="preserve">Pantalla de Firefox "Advertencia: riesgo probable de seguridad" con el código SEC_ERROR_UNKNOWN_ISSUER.</w:t>
-            </w:r>
-          </w:p>
-        </w:tc>
-      </w:tr>
-    </w:tbl>
+    <w:p>
+      <w:pPr>
+        <w:spacing w:after="60" w:before="160"/>
+        <w:jc w:val="center"/>
+      </w:pPr>
+      <w:r>
+        <w:drawing>
+          <wp:inline distT="0" distB="0" distL="0" distR="0">
+            <wp:extent cx="5905500" cy="3314700"/>
+            <wp:effectExtent t="0" r="0" b="0" l="0"/>
+            <wp:docPr id="1" name="" descr="" title=""/>
+            <wp:cNvGraphicFramePr>
+              <a:graphicFrameLocks xmlns:a="http://schemas.openxmlformats.org/drawingml/2006/main" noChangeAspect="1"/>
+            </wp:cNvGraphicFramePr>
+            <a:graphic xmlns:a="http://schemas.openxmlformats.org/drawingml/2006/main">
+              <a:graphicData uri="http://schemas.openxmlformats.org/drawingml/2006/picture">
+                <pic:pic xmlns:pic="http://schemas.openxmlformats.org/drawingml/2006/picture">
+                  <pic:nvPicPr>
+                    <pic:cNvPr id="0" name="" descr=""/>
+                    <pic:cNvPicPr>
+                      <a:picLocks noChangeAspect="1" noChangeArrowheads="1"/>
+                    </pic:cNvPicPr>
+                  </pic:nvPicPr>
+                  <pic:blipFill>
+                    <a:blip r:embed="rId16" cstate="none"/>
+                    <a:srcRect/>
+                    <a:stretch>
+                      <a:fillRect/>
+                    </a:stretch>
+                  </pic:blipFill>
+                  <pic:spPr bwMode="auto">
+                    <a:xfrm>
+                      <a:off x="0" y="0"/>
+                      <a:ext cx="5905500" cy="3314700"/>
+                    </a:xfrm>
+                    <a:prstGeom prst="rect">
+                      <a:avLst/>
+                    </a:prstGeom>
+                  </pic:spPr>
+                </pic:pic>
+              </a:graphicData>
+            </a:graphic>
+          </wp:inline>
+        </w:drawing>
+      </w:r>
+    </w:p>
+    <w:p>
+      <w:pPr>
+        <w:spacing w:after="240"/>
+        <w:jc w:val="center"/>
+      </w:pPr>
+      <w:r>
+        <w:rPr>
+          <w:i/>
+          <w:iCs/>
+          <w:color w:val="555555"/>
+          <w:sz w:val="18"/>
+          <w:szCs w:val="18"/>
+        </w:rPr>
+        <w:t xml:space="preserve">Figura 9. El sitio ya responde por HTTPS, pero el navegador tacha el protocolo en la barra de direcciones y mantiene el aviso de conexion no segura: cifra, pero no puede validar la identidad.</w:t>
+      </w:r>
+    </w:p>
     <w:p>
       <w:pPr>
         <w:spacing w:after="0"/>
@@ -3130,72 +3358,68 @@
         <w:t xml:space="preserve"/>
       </w:r>
     </w:p>
-    <w:tbl>
-      <w:tblPr>
-        <w:tblW w:type="dxa" w:w="9360"/>
-        <w:tblBorders>
-          <w:top w:val="single" w:color="auto" w:sz="4"/>
-          <w:left w:val="single" w:color="auto" w:sz="4"/>
-          <w:bottom w:val="single" w:color="auto" w:sz="4"/>
-          <w:right w:val="single" w:color="auto" w:sz="4"/>
-          <w:insideH w:val="single" w:color="auto" w:sz="4"/>
-          <w:insideV w:val="single" w:color="auto" w:sz="4"/>
-        </w:tblBorders>
-      </w:tblPr>
-      <w:tblGrid>
-        <w:gridCol w:w="9360"/>
-      </w:tblGrid>
-      <w:tr>
-        <w:tc>
-          <w:tcPr>
-            <w:tcW w:type="dxa" w:w="9360"/>
-            <w:tcBorders>
-              <w:top w:val="dashed" w:color="D9A441" w:sz="6"/>
-              <w:left w:val="dashed" w:color="D9A441" w:sz="6"/>
-              <w:bottom w:val="dashed" w:color="D9A441" w:sz="6"/>
-              <w:right w:val="dashed" w:color="D9A441" w:sz="6"/>
-            </w:tcBorders>
-            <w:shd w:fill="FFF7E6" w:color="auto" w:val="clear"/>
-            <w:tcMar>
-              <w:top w:type="dxa" w:w="160"/>
-              <w:left w:type="dxa" w:w="160"/>
-              <w:bottom w:type="dxa" w:w="160"/>
-              <w:right w:type="dxa" w:w="160"/>
-            </w:tcMar>
-          </w:tcPr>
-          <w:p>
-            <w:pPr>
-              <w:spacing w:after="60"/>
-            </w:pPr>
-            <w:r>
-              <w:rPr>
-                <w:b/>
-                <w:bCs/>
-                <w:color w:val="8A5A00"/>
-                <w:sz w:val="20"/>
-                <w:szCs w:val="20"/>
-              </w:rPr>
-              <w:t xml:space="preserve">INSERTAR CAPTURA  ·  06-autofirmado-detalle.png</w:t>
-            </w:r>
-          </w:p>
-          <w:p>
-            <w:pPr>
-              <w:spacing w:after="0"/>
-            </w:pPr>
-            <w:r>
-              <w:rPr>
-                <w:i/>
-                <w:iCs/>
-                <w:color w:val="6B4A00"/>
-                <w:sz w:val="20"/>
-                <w:szCs w:val="20"/>
-              </w:rPr>
-              <w:t xml:space="preserve">Visor de certificados de Firefox: "Emitido para" y "Emitido por" con el mismo nombre.</w:t>
-            </w:r>
-          </w:p>
-        </w:tc>
-      </w:tr>
-    </w:tbl>
+    <w:p>
+      <w:pPr>
+        <w:spacing w:after="60" w:before="160"/>
+        <w:jc w:val="center"/>
+      </w:pPr>
+      <w:r>
+        <w:drawing>
+          <wp:inline distT="0" distB="0" distL="0" distR="0">
+            <wp:extent cx="5905500" cy="5276850"/>
+            <wp:effectExtent t="0" r="0" b="0" l="0"/>
+            <wp:docPr id="1" name="" descr="" title=""/>
+            <wp:cNvGraphicFramePr>
+              <a:graphicFrameLocks xmlns:a="http://schemas.openxmlformats.org/drawingml/2006/main" noChangeAspect="1"/>
+            </wp:cNvGraphicFramePr>
+            <a:graphic xmlns:a="http://schemas.openxmlformats.org/drawingml/2006/main">
+              <a:graphicData uri="http://schemas.openxmlformats.org/drawingml/2006/picture">
+                <pic:pic xmlns:pic="http://schemas.openxmlformats.org/drawingml/2006/picture">
+                  <pic:nvPicPr>
+                    <pic:cNvPr id="0" name="" descr=""/>
+                    <pic:cNvPicPr>
+                      <a:picLocks noChangeAspect="1" noChangeArrowheads="1"/>
+                    </pic:cNvPicPr>
+                  </pic:nvPicPr>
+                  <pic:blipFill>
+                    <a:blip r:embed="rId17" cstate="none"/>
+                    <a:srcRect/>
+                    <a:stretch>
+                      <a:fillRect/>
+                    </a:stretch>
+                  </pic:blipFill>
+                  <pic:spPr bwMode="auto">
+                    <a:xfrm>
+                      <a:off x="0" y="0"/>
+                      <a:ext cx="5905500" cy="5276850"/>
+                    </a:xfrm>
+                    <a:prstGeom prst="rect">
+                      <a:avLst/>
+                    </a:prstGeom>
+                  </pic:spPr>
+                </pic:pic>
+              </a:graphicData>
+            </a:graphic>
+          </wp:inline>
+        </w:drawing>
+      </w:r>
+    </w:p>
+    <w:p>
+      <w:pPr>
+        <w:spacing w:after="240"/>
+        <w:jc w:val="center"/>
+      </w:pPr>
+      <w:r>
+        <w:rPr>
+          <w:i/>
+          <w:iCs/>
+          <w:color w:val="555555"/>
+          <w:sz w:val="18"/>
+          <w:szCs w:val="18"/>
+        </w:rPr>
+        <w:t xml:space="preserve">Figura 10. Visor de certificados. "Issued To" e "Issued By" son identicos, y la vigencia llega a diciembre de 2028: 825 dias, el maximo que aceptan los navegadores.</w:t>
+      </w:r>
+    </w:p>
     <w:p>
       <w:pPr>
         <w:spacing w:after="0"/>
@@ -3208,72 +3432,68 @@
         <w:t xml:space="preserve"/>
       </w:r>
     </w:p>
-    <w:tbl>
-      <w:tblPr>
-        <w:tblW w:type="dxa" w:w="9360"/>
-        <w:tblBorders>
-          <w:top w:val="single" w:color="auto" w:sz="4"/>
-          <w:left w:val="single" w:color="auto" w:sz="4"/>
-          <w:bottom w:val="single" w:color="auto" w:sz="4"/>
-          <w:right w:val="single" w:color="auto" w:sz="4"/>
-          <w:insideH w:val="single" w:color="auto" w:sz="4"/>
-          <w:insideV w:val="single" w:color="auto" w:sz="4"/>
-        </w:tblBorders>
-      </w:tblPr>
-      <w:tblGrid>
-        <w:gridCol w:w="9360"/>
-      </w:tblGrid>
-      <w:tr>
-        <w:tc>
-          <w:tcPr>
-            <w:tcW w:type="dxa" w:w="9360"/>
-            <w:tcBorders>
-              <w:top w:val="dashed" w:color="D9A441" w:sz="6"/>
-              <w:left w:val="dashed" w:color="D9A441" w:sz="6"/>
-              <w:bottom w:val="dashed" w:color="D9A441" w:sz="6"/>
-              <w:right w:val="dashed" w:color="D9A441" w:sz="6"/>
-            </w:tcBorders>
-            <w:shd w:fill="FFF7E6" w:color="auto" w:val="clear"/>
-            <w:tcMar>
-              <w:top w:type="dxa" w:w="160"/>
-              <w:left w:type="dxa" w:w="160"/>
-              <w:bottom w:type="dxa" w:w="160"/>
-              <w:right w:type="dxa" w:w="160"/>
-            </w:tcMar>
-          </w:tcPr>
-          <w:p>
-            <w:pPr>
-              <w:spacing w:after="60"/>
-            </w:pPr>
-            <w:r>
-              <w:rPr>
-                <w:b/>
-                <w:bCs/>
-                <w:color w:val="8A5A00"/>
-                <w:sz w:val="20"/>
-                <w:szCs w:val="20"/>
-              </w:rPr>
-              <w:t xml:space="preserve">INSERTAR CAPTURA  ·  07-autofirmado-ssllabs.png</w:t>
-            </w:r>
-          </w:p>
-          <w:p>
-            <w:pPr>
-              <w:spacing w:after="0"/>
-            </w:pPr>
-            <w:r>
-              <w:rPr>
-                <w:i/>
-                <w:iCs/>
-                <w:color w:val="6B4A00"/>
-                <w:sz w:val="20"/>
-                <w:szCs w:val="20"/>
-              </w:rPr>
-              <w:t xml:space="preserve">SSL Labs con calificación T sobre santafe-pineda.shop.</w:t>
-            </w:r>
-          </w:p>
-        </w:tc>
-      </w:tr>
-    </w:tbl>
+    <w:p>
+      <w:pPr>
+        <w:spacing w:after="60" w:before="160"/>
+        <w:jc w:val="center"/>
+      </w:pPr>
+      <w:r>
+        <w:drawing>
+          <wp:inline distT="0" distB="0" distL="0" distR="0">
+            <wp:extent cx="5905500" cy="5524500"/>
+            <wp:effectExtent t="0" r="0" b="0" l="0"/>
+            <wp:docPr id="1" name="" descr="" title=""/>
+            <wp:cNvGraphicFramePr>
+              <a:graphicFrameLocks xmlns:a="http://schemas.openxmlformats.org/drawingml/2006/main" noChangeAspect="1"/>
+            </wp:cNvGraphicFramePr>
+            <a:graphic xmlns:a="http://schemas.openxmlformats.org/drawingml/2006/main">
+              <a:graphicData uri="http://schemas.openxmlformats.org/drawingml/2006/picture">
+                <pic:pic xmlns:pic="http://schemas.openxmlformats.org/drawingml/2006/picture">
+                  <pic:nvPicPr>
+                    <pic:cNvPr id="0" name="" descr=""/>
+                    <pic:cNvPicPr>
+                      <a:picLocks noChangeAspect="1" noChangeArrowheads="1"/>
+                    </pic:cNvPicPr>
+                  </pic:nvPicPr>
+                  <pic:blipFill>
+                    <a:blip r:embed="rId18" cstate="none"/>
+                    <a:srcRect/>
+                    <a:stretch>
+                      <a:fillRect/>
+                    </a:stretch>
+                  </pic:blipFill>
+                  <pic:spPr bwMode="auto">
+                    <a:xfrm>
+                      <a:off x="0" y="0"/>
+                      <a:ext cx="5905500" cy="5524500"/>
+                    </a:xfrm>
+                    <a:prstGeom prst="rect">
+                      <a:avLst/>
+                    </a:prstGeom>
+                  </pic:spPr>
+                </pic:pic>
+              </a:graphicData>
+            </a:graphic>
+          </wp:inline>
+        </w:drawing>
+      </w:r>
+    </w:p>
+    <w:p>
+      <w:pPr>
+        <w:spacing w:after="240"/>
+        <w:jc w:val="center"/>
+      </w:pPr>
+      <w:r>
+        <w:rPr>
+          <w:i/>
+          <w:iCs/>
+          <w:color w:val="555555"/>
+          <w:sz w:val="18"/>
+          <w:szCs w:val="18"/>
+        </w:rPr>
+        <w:t xml:space="preserve">Figura 11. SSL Labs califica con T por fallo de confianza. La nota al pie es reveladora: "If trust issues are ignored: A". El canal es correcto; lo que falta es el respaldo de una Autoridad.</w:t>
+      </w:r>
+    </w:p>
     <w:p>
       <w:pPr>
         <w:spacing w:after="0"/>
@@ -3286,72 +3506,68 @@
         <w:t xml:space="preserve"/>
       </w:r>
     </w:p>
-    <w:tbl>
-      <w:tblPr>
-        <w:tblW w:type="dxa" w:w="9360"/>
-        <w:tblBorders>
-          <w:top w:val="single" w:color="auto" w:sz="4"/>
-          <w:left w:val="single" w:color="auto" w:sz="4"/>
-          <w:bottom w:val="single" w:color="auto" w:sz="4"/>
-          <w:right w:val="single" w:color="auto" w:sz="4"/>
-          <w:insideH w:val="single" w:color="auto" w:sz="4"/>
-          <w:insideV w:val="single" w:color="auto" w:sz="4"/>
-        </w:tblBorders>
-      </w:tblPr>
-      <w:tblGrid>
-        <w:gridCol w:w="9360"/>
-      </w:tblGrid>
-      <w:tr>
-        <w:tc>
-          <w:tcPr>
-            <w:tcW w:type="dxa" w:w="9360"/>
-            <w:tcBorders>
-              <w:top w:val="dashed" w:color="D9A441" w:sz="6"/>
-              <w:left w:val="dashed" w:color="D9A441" w:sz="6"/>
-              <w:bottom w:val="dashed" w:color="D9A441" w:sz="6"/>
-              <w:right w:val="dashed" w:color="D9A441" w:sz="6"/>
-            </w:tcBorders>
-            <w:shd w:fill="FFF7E6" w:color="auto" w:val="clear"/>
-            <w:tcMar>
-              <w:top w:type="dxa" w:w="160"/>
-              <w:left w:type="dxa" w:w="160"/>
-              <w:bottom w:type="dxa" w:w="160"/>
-              <w:right w:type="dxa" w:w="160"/>
-            </w:tcMar>
-          </w:tcPr>
-          <w:p>
-            <w:pPr>
-              <w:spacing w:after="60"/>
-            </w:pPr>
-            <w:r>
-              <w:rPr>
-                <w:b/>
-                <w:bCs/>
-                <w:color w:val="8A5A00"/>
-                <w:sz w:val="20"/>
-                <w:szCs w:val="20"/>
-              </w:rPr>
-              <w:t xml:space="preserve">INSERTAR CAPTURA  ·  08-autofirmado-sclient.png</w:t>
-            </w:r>
-          </w:p>
-          <w:p>
-            <w:pPr>
-              <w:spacing w:after="0"/>
-            </w:pPr>
-            <w:r>
-              <w:rPr>
-                <w:i/>
-                <w:iCs/>
-                <w:color w:val="6B4A00"/>
-                <w:sz w:val="20"/>
-                <w:szCs w:val="20"/>
-              </w:rPr>
-              <w:t xml:space="preserve">Salida de openssl s_client mostrando verify error:num=18:self-signed certificate.</w:t>
-            </w:r>
-          </w:p>
-        </w:tc>
-      </w:tr>
-    </w:tbl>
+    <w:p>
+      <w:pPr>
+        <w:spacing w:after="60" w:before="160"/>
+        <w:jc w:val="center"/>
+      </w:pPr>
+      <w:r>
+        <w:drawing>
+          <wp:inline distT="0" distB="0" distL="0" distR="0">
+            <wp:extent cx="5905500" cy="1543050"/>
+            <wp:effectExtent t="0" r="0" b="0" l="0"/>
+            <wp:docPr id="1" name="" descr="" title=""/>
+            <wp:cNvGraphicFramePr>
+              <a:graphicFrameLocks xmlns:a="http://schemas.openxmlformats.org/drawingml/2006/main" noChangeAspect="1"/>
+            </wp:cNvGraphicFramePr>
+            <a:graphic xmlns:a="http://schemas.openxmlformats.org/drawingml/2006/main">
+              <a:graphicData uri="http://schemas.openxmlformats.org/drawingml/2006/picture">
+                <pic:pic xmlns:pic="http://schemas.openxmlformats.org/drawingml/2006/picture">
+                  <pic:nvPicPr>
+                    <pic:cNvPr id="0" name="" descr=""/>
+                    <pic:cNvPicPr>
+                      <a:picLocks noChangeAspect="1" noChangeArrowheads="1"/>
+                    </pic:cNvPicPr>
+                  </pic:nvPicPr>
+                  <pic:blipFill>
+                    <a:blip r:embed="rId19" cstate="none"/>
+                    <a:srcRect/>
+                    <a:stretch>
+                      <a:fillRect/>
+                    </a:stretch>
+                  </pic:blipFill>
+                  <pic:spPr bwMode="auto">
+                    <a:xfrm>
+                      <a:off x="0" y="0"/>
+                      <a:ext cx="5905500" cy="1543050"/>
+                    </a:xfrm>
+                    <a:prstGeom prst="rect">
+                      <a:avLst/>
+                    </a:prstGeom>
+                  </pic:spPr>
+                </pic:pic>
+              </a:graphicData>
+            </a:graphic>
+          </wp:inline>
+        </w:drawing>
+      </w:r>
+    </w:p>
+    <w:p>
+      <w:pPr>
+        <w:spacing w:after="240"/>
+        <w:jc w:val="center"/>
+      </w:pPr>
+      <w:r>
+        <w:rPr>
+          <w:i/>
+          <w:iCs/>
+          <w:color w:val="555555"/>
+          <w:sz w:val="18"/>
+          <w:szCs w:val="18"/>
+        </w:rPr>
+        <w:t xml:space="preserve">Figura 12. Comprobacion desde consola: verify error:num=18:self-signed certificate. La cadena empieza y termina en el propio servidor.</w:t>
+      </w:r>
+    </w:p>
     <w:p>
       <w:r>
         <w:br w:type="page"/>
@@ -5915,6 +6131,252 @@
         <w:t xml:space="preserve"> y reto http-01 no puede renovarse sin intervención por diseño, porque certbot necesita que alguien vuelva a colocar el token. Es un rasgo del modo elegido, no una limitación imprevista: la renovación se describe en el apartado 10.</w:t>
       </w:r>
     </w:p>
+    <w:p>
+      <w:pPr>
+        <w:spacing w:after="60" w:before="160"/>
+        <w:jc w:val="center"/>
+      </w:pPr>
+      <w:r>
+        <w:drawing>
+          <wp:inline distT="0" distB="0" distL="0" distR="0">
+            <wp:extent cx="5905500" cy="3324225"/>
+            <wp:effectExtent t="0" r="0" b="0" l="0"/>
+            <wp:docPr id="1" name="" descr="" title=""/>
+            <wp:cNvGraphicFramePr>
+              <a:graphicFrameLocks xmlns:a="http://schemas.openxmlformats.org/drawingml/2006/main" noChangeAspect="1"/>
+            </wp:cNvGraphicFramePr>
+            <a:graphic xmlns:a="http://schemas.openxmlformats.org/drawingml/2006/main">
+              <a:graphicData uri="http://schemas.openxmlformats.org/drawingml/2006/picture">
+                <pic:pic xmlns:pic="http://schemas.openxmlformats.org/drawingml/2006/picture">
+                  <pic:nvPicPr>
+                    <pic:cNvPr id="0" name="" descr=""/>
+                    <pic:cNvPicPr>
+                      <a:picLocks noChangeAspect="1" noChangeArrowheads="1"/>
+                    </pic:cNvPicPr>
+                  </pic:nvPicPr>
+                  <pic:blipFill>
+                    <a:blip r:embed="rId20" cstate="none"/>
+                    <a:srcRect/>
+                    <a:stretch>
+                      <a:fillRect/>
+                    </a:stretch>
+                  </pic:blipFill>
+                  <pic:spPr bwMode="auto">
+                    <a:xfrm>
+                      <a:off x="0" y="0"/>
+                      <a:ext cx="5905500" cy="3324225"/>
+                    </a:xfrm>
+                    <a:prstGeom prst="rect">
+                      <a:avLst/>
+                    </a:prstGeom>
+                  </pic:spPr>
+                </pic:pic>
+              </a:graphicData>
+            </a:graphic>
+          </wp:inline>
+        </w:drawing>
+      </w:r>
+    </w:p>
+    <w:p>
+      <w:pPr>
+        <w:spacing w:after="240"/>
+        <w:jc w:val="center"/>
+      </w:pPr>
+      <w:r>
+        <w:rPr>
+          <w:i/>
+          <w:iCs/>
+          <w:color w:val="555555"/>
+          <w:sz w:val="18"/>
+          <w:szCs w:val="18"/>
+        </w:rPr>
+        <w:t xml:space="preserve">Figura 13. La emision manual completa. A la izquierda, el archivo de renovacion que certbot deja escrito, con authenticator = manual y pref_challs = http-01, y el resumen de archivos creados y modificados. A la derecha, los DOS retos depositados a mano, uno por cada nombre del certificado, comprobados con HTTP 200 y acumulados sin sustituirse.</w:t>
+      </w:r>
+    </w:p>
+    <w:p>
+      <w:pPr>
+        <w:spacing w:after="0"/>
+      </w:pPr>
+      <w:r>
+        <w:rPr>
+          <w:sz w:val="22"/>
+          <w:szCs w:val="22"/>
+        </w:rPr>
+        <w:t xml:space="preserve"/>
+      </w:r>
+    </w:p>
+    <w:p>
+      <w:pPr>
+        <w:spacing w:after="0"/>
+      </w:pPr>
+      <w:r>
+        <w:rPr>
+          <w:sz w:val="22"/>
+          <w:szCs w:val="22"/>
+        </w:rPr>
+        <w:t xml:space="preserve"/>
+      </w:r>
+    </w:p>
+    <w:p>
+      <w:pPr>
+        <w:spacing w:after="0"/>
+      </w:pPr>
+      <w:r>
+        <w:rPr>
+          <w:sz w:val="22"/>
+          <w:szCs w:val="22"/>
+        </w:rPr>
+        <w:t xml:space="preserve"/>
+      </w:r>
+    </w:p>
+    <w:p>
+      <w:pPr>
+        <w:spacing w:after="60" w:before="160"/>
+        <w:jc w:val="center"/>
+      </w:pPr>
+      <w:r>
+        <w:drawing>
+          <wp:inline distT="0" distB="0" distL="0" distR="0">
+            <wp:extent cx="5905500" cy="3286125"/>
+            <wp:effectExtent t="0" r="0" b="0" l="0"/>
+            <wp:docPr id="1" name="" descr="" title=""/>
+            <wp:cNvGraphicFramePr>
+              <a:graphicFrameLocks xmlns:a="http://schemas.openxmlformats.org/drawingml/2006/main" noChangeAspect="1"/>
+            </wp:cNvGraphicFramePr>
+            <a:graphic xmlns:a="http://schemas.openxmlformats.org/drawingml/2006/main">
+              <a:graphicData uri="http://schemas.openxmlformats.org/drawingml/2006/picture">
+                <pic:pic xmlns:pic="http://schemas.openxmlformats.org/drawingml/2006/picture">
+                  <pic:nvPicPr>
+                    <pic:cNvPr id="0" name="" descr=""/>
+                    <pic:cNvPicPr>
+                      <a:picLocks noChangeAspect="1" noChangeArrowheads="1"/>
+                    </pic:cNvPicPr>
+                  </pic:nvPicPr>
+                  <pic:blipFill>
+                    <a:blip r:embed="rId21" cstate="none"/>
+                    <a:srcRect/>
+                    <a:stretch>
+                      <a:fillRect/>
+                    </a:stretch>
+                  </pic:blipFill>
+                  <pic:spPr bwMode="auto">
+                    <a:xfrm>
+                      <a:off x="0" y="0"/>
+                      <a:ext cx="5905500" cy="3286125"/>
+                    </a:xfrm>
+                    <a:prstGeom prst="rect">
+                      <a:avLst/>
+                    </a:prstGeom>
+                  </pic:spPr>
+                </pic:pic>
+              </a:graphicData>
+            </a:graphic>
+          </wp:inline>
+        </w:drawing>
+      </w:r>
+    </w:p>
+    <w:p>
+      <w:pPr>
+        <w:spacing w:after="240"/>
+        <w:jc w:val="center"/>
+      </w:pPr>
+      <w:r>
+        <w:rPr>
+          <w:i/>
+          <w:iCs/>
+          <w:color w:val="555555"/>
+          <w:sz w:val="18"/>
+          <w:szCs w:val="18"/>
+        </w:rPr>
+        <w:t xml:space="preserve">Figura 14. Contenido de /etc/letsencrypt/live/: los cuatro archivos son enlaces simbolicos hacia archive/. Debajo, el archivo de renovacion con los parametros de la emision.</w:t>
+      </w:r>
+    </w:p>
+    <w:p>
+      <w:pPr>
+        <w:spacing w:after="0"/>
+      </w:pPr>
+      <w:r>
+        <w:rPr>
+          <w:sz w:val="22"/>
+          <w:szCs w:val="22"/>
+        </w:rPr>
+        <w:t xml:space="preserve"/>
+      </w:r>
+    </w:p>
+    <w:p>
+      <w:pPr>
+        <w:spacing w:after="60" w:before="160"/>
+        <w:jc w:val="center"/>
+      </w:pPr>
+      <w:r>
+        <w:drawing>
+          <wp:inline distT="0" distB="0" distL="0" distR="0">
+            <wp:extent cx="5905500" cy="2000250"/>
+            <wp:effectExtent t="0" r="0" b="0" l="0"/>
+            <wp:docPr id="1" name="" descr="" title=""/>
+            <wp:cNvGraphicFramePr>
+              <a:graphicFrameLocks xmlns:a="http://schemas.openxmlformats.org/drawingml/2006/main" noChangeAspect="1"/>
+            </wp:cNvGraphicFramePr>
+            <a:graphic xmlns:a="http://schemas.openxmlformats.org/drawingml/2006/main">
+              <a:graphicData uri="http://schemas.openxmlformats.org/drawingml/2006/picture">
+                <pic:pic xmlns:pic="http://schemas.openxmlformats.org/drawingml/2006/picture">
+                  <pic:nvPicPr>
+                    <pic:cNvPr id="0" name="" descr=""/>
+                    <pic:cNvPicPr>
+                      <a:picLocks noChangeAspect="1" noChangeArrowheads="1"/>
+                    </pic:cNvPicPr>
+                  </pic:nvPicPr>
+                  <pic:blipFill>
+                    <a:blip r:embed="rId22" cstate="none"/>
+                    <a:srcRect/>
+                    <a:stretch>
+                      <a:fillRect/>
+                    </a:stretch>
+                  </pic:blipFill>
+                  <pic:spPr bwMode="auto">
+                    <a:xfrm>
+                      <a:off x="0" y="0"/>
+                      <a:ext cx="5905500" cy="2000250"/>
+                    </a:xfrm>
+                    <a:prstGeom prst="rect">
+                      <a:avLst/>
+                    </a:prstGeom>
+                  </pic:spPr>
+                </pic:pic>
+              </a:graphicData>
+            </a:graphic>
+          </wp:inline>
+        </w:drawing>
+      </w:r>
+    </w:p>
+    <w:p>
+      <w:pPr>
+        <w:spacing w:after="240"/>
+        <w:jc w:val="center"/>
+      </w:pPr>
+      <w:r>
+        <w:rPr>
+          <w:i/>
+          <w:iCs/>
+          <w:color w:val="555555"/>
+          <w:sz w:val="18"/>
+          <w:szCs w:val="18"/>
+        </w:rPr>
+        <w:t xml:space="preserve">Figura 15. Las lineas del archivo de nginx escritas a mano: las tres directivas del certificado, la redireccion 301 del puerto 80 y la cabecera HSTS. No aparece ningun comentario "managed by Certbot", que es lo que habria dejado el instalador automatico.</w:t>
+      </w:r>
+    </w:p>
+    <w:p>
+      <w:pPr>
+        <w:spacing w:after="0"/>
+      </w:pPr>
+      <w:r>
+        <w:rPr>
+          <w:sz w:val="22"/>
+          <w:szCs w:val="22"/>
+        </w:rPr>
+        <w:t xml:space="preserve"/>
+      </w:r>
+    </w:p>
     <w:tbl>
       <w:tblPr>
         <w:tblW w:type="dxa" w:w="9360"/>
@@ -5960,7 +6422,7 @@
                 <w:sz w:val="20"/>
                 <w:szCs w:val="20"/>
               </w:rPr>
-              <w:t xml:space="preserve">INSERTAR CAPTURA  ·  09-certbot-pausa.png</w:t>
+              <w:t xml:space="preserve">INSERTAR CAPTURA  ·  14-renovacion-desactivada.png</w:t>
             </w:r>
           </w:p>
           <w:p>
@@ -5975,397 +6437,7 @@
                 <w:sz w:val="20"/>
                 <w:szCs w:val="20"/>
               </w:rPr>
-              <w:t xml:space="preserve">Certbot detenido, mostrando el contenido del archivo del reto y la URL donde debe quedar disponible. Es la evidencia central de que la emisión fue manual.</w:t>
-            </w:r>
-          </w:p>
-        </w:tc>
-      </w:tr>
-    </w:tbl>
-    <w:p>
-      <w:pPr>
-        <w:spacing w:after="0"/>
-      </w:pPr>
-      <w:r>
-        <w:rPr>
-          <w:sz w:val="22"/>
-          <w:szCs w:val="22"/>
-        </w:rPr>
-        <w:t xml:space="preserve"/>
-      </w:r>
-    </w:p>
-    <w:tbl>
-      <w:tblPr>
-        <w:tblW w:type="dxa" w:w="9360"/>
-        <w:tblBorders>
-          <w:top w:val="single" w:color="auto" w:sz="4"/>
-          <w:left w:val="single" w:color="auto" w:sz="4"/>
-          <w:bottom w:val="single" w:color="auto" w:sz="4"/>
-          <w:right w:val="single" w:color="auto" w:sz="4"/>
-          <w:insideH w:val="single" w:color="auto" w:sz="4"/>
-          <w:insideV w:val="single" w:color="auto" w:sz="4"/>
-        </w:tblBorders>
-      </w:tblPr>
-      <w:tblGrid>
-        <w:gridCol w:w="9360"/>
-      </w:tblGrid>
-      <w:tr>
-        <w:tc>
-          <w:tcPr>
-            <w:tcW w:type="dxa" w:w="9360"/>
-            <w:tcBorders>
-              <w:top w:val="dashed" w:color="D9A441" w:sz="6"/>
-              <w:left w:val="dashed" w:color="D9A441" w:sz="6"/>
-              <w:bottom w:val="dashed" w:color="D9A441" w:sz="6"/>
-              <w:right w:val="dashed" w:color="D9A441" w:sz="6"/>
-            </w:tcBorders>
-            <w:shd w:fill="FFF7E6" w:color="auto" w:val="clear"/>
-            <w:tcMar>
-              <w:top w:type="dxa" w:w="160"/>
-              <w:left w:type="dxa" w:w="160"/>
-              <w:bottom w:type="dxa" w:w="160"/>
-              <w:right w:type="dxa" w:w="160"/>
-            </w:tcMar>
-          </w:tcPr>
-          <w:p>
-            <w:pPr>
-              <w:spacing w:after="60"/>
-            </w:pPr>
-            <w:r>
-              <w:rPr>
-                <w:b/>
-                <w:bCs/>
-                <w:color w:val="8A5A00"/>
-                <w:sz w:val="20"/>
-                <w:szCs w:val="20"/>
-              </w:rPr>
-              <w:t xml:space="preserve">INSERTAR CAPTURA  ·  10-token-creado.png</w:t>
-            </w:r>
-          </w:p>
-          <w:p>
-            <w:pPr>
-              <w:spacing w:after="0"/>
-            </w:pPr>
-            <w:r>
-              <w:rPr>
-                <w:i/>
-                <w:iCs/>
-                <w:color w:val="6B4A00"/>
-                <w:sz w:val="20"/>
-                <w:szCs w:val="20"/>
-              </w:rPr>
-              <w:t xml:space="preserve">Segunda sesión SSH: creación del archivo del reto y el curl que devuelve el token.</w:t>
-            </w:r>
-          </w:p>
-        </w:tc>
-      </w:tr>
-    </w:tbl>
-    <w:p>
-      <w:pPr>
-        <w:spacing w:after="0"/>
-      </w:pPr>
-      <w:r>
-        <w:rPr>
-          <w:sz w:val="22"/>
-          <w:szCs w:val="22"/>
-        </w:rPr>
-        <w:t xml:space="preserve"/>
-      </w:r>
-    </w:p>
-    <w:tbl>
-      <w:tblPr>
-        <w:tblW w:type="dxa" w:w="9360"/>
-        <w:tblBorders>
-          <w:top w:val="single" w:color="auto" w:sz="4"/>
-          <w:left w:val="single" w:color="auto" w:sz="4"/>
-          <w:bottom w:val="single" w:color="auto" w:sz="4"/>
-          <w:right w:val="single" w:color="auto" w:sz="4"/>
-          <w:insideH w:val="single" w:color="auto" w:sz="4"/>
-          <w:insideV w:val="single" w:color="auto" w:sz="4"/>
-        </w:tblBorders>
-      </w:tblPr>
-      <w:tblGrid>
-        <w:gridCol w:w="9360"/>
-      </w:tblGrid>
-      <w:tr>
-        <w:tc>
-          <w:tcPr>
-            <w:tcW w:type="dxa" w:w="9360"/>
-            <w:tcBorders>
-              <w:top w:val="dashed" w:color="D9A441" w:sz="6"/>
-              <w:left w:val="dashed" w:color="D9A441" w:sz="6"/>
-              <w:bottom w:val="dashed" w:color="D9A441" w:sz="6"/>
-              <w:right w:val="dashed" w:color="D9A441" w:sz="6"/>
-            </w:tcBorders>
-            <w:shd w:fill="FFF7E6" w:color="auto" w:val="clear"/>
-            <w:tcMar>
-              <w:top w:type="dxa" w:w="160"/>
-              <w:left w:type="dxa" w:w="160"/>
-              <w:bottom w:type="dxa" w:w="160"/>
-              <w:right w:type="dxa" w:w="160"/>
-            </w:tcMar>
-          </w:tcPr>
-          <w:p>
-            <w:pPr>
-              <w:spacing w:after="60"/>
-            </w:pPr>
-            <w:r>
-              <w:rPr>
-                <w:b/>
-                <w:bCs/>
-                <w:color w:val="8A5A00"/>
-                <w:sz w:val="20"/>
-                <w:szCs w:val="20"/>
-              </w:rPr>
-              <w:t xml:space="preserve">INSERTAR CAPTURA  ·  11-certbot-exito.png</w:t>
-            </w:r>
-          </w:p>
-          <w:p>
-            <w:pPr>
-              <w:spacing w:after="0"/>
-            </w:pPr>
-            <w:r>
-              <w:rPr>
-                <w:i/>
-                <w:iCs/>
-                <w:color w:val="6B4A00"/>
-                <w:sz w:val="20"/>
-                <w:szCs w:val="20"/>
-              </w:rPr>
-              <w:t xml:space="preserve">"Successfully received certificate" con las rutas de /etc/letsencrypt/live/.</w:t>
-            </w:r>
-          </w:p>
-        </w:tc>
-      </w:tr>
-    </w:tbl>
-    <w:p>
-      <w:pPr>
-        <w:spacing w:after="0"/>
-      </w:pPr>
-      <w:r>
-        <w:rPr>
-          <w:sz w:val="22"/>
-          <w:szCs w:val="22"/>
-        </w:rPr>
-        <w:t xml:space="preserve"/>
-      </w:r>
-    </w:p>
-    <w:tbl>
-      <w:tblPr>
-        <w:tblW w:type="dxa" w:w="9360"/>
-        <w:tblBorders>
-          <w:top w:val="single" w:color="auto" w:sz="4"/>
-          <w:left w:val="single" w:color="auto" w:sz="4"/>
-          <w:bottom w:val="single" w:color="auto" w:sz="4"/>
-          <w:right w:val="single" w:color="auto" w:sz="4"/>
-          <w:insideH w:val="single" w:color="auto" w:sz="4"/>
-          <w:insideV w:val="single" w:color="auto" w:sz="4"/>
-        </w:tblBorders>
-      </w:tblPr>
-      <w:tblGrid>
-        <w:gridCol w:w="9360"/>
-      </w:tblGrid>
-      <w:tr>
-        <w:tc>
-          <w:tcPr>
-            <w:tcW w:type="dxa" w:w="9360"/>
-            <w:tcBorders>
-              <w:top w:val="dashed" w:color="D9A441" w:sz="6"/>
-              <w:left w:val="dashed" w:color="D9A441" w:sz="6"/>
-              <w:bottom w:val="dashed" w:color="D9A441" w:sz="6"/>
-              <w:right w:val="dashed" w:color="D9A441" w:sz="6"/>
-            </w:tcBorders>
-            <w:shd w:fill="FFF7E6" w:color="auto" w:val="clear"/>
-            <w:tcMar>
-              <w:top w:type="dxa" w:w="160"/>
-              <w:left w:type="dxa" w:w="160"/>
-              <w:bottom w:type="dxa" w:w="160"/>
-              <w:right w:type="dxa" w:w="160"/>
-            </w:tcMar>
-          </w:tcPr>
-          <w:p>
-            <w:pPr>
-              <w:spacing w:after="60"/>
-            </w:pPr>
-            <w:r>
-              <w:rPr>
-                <w:b/>
-                <w:bCs/>
-                <w:color w:val="8A5A00"/>
-                <w:sz w:val="20"/>
-                <w:szCs w:val="20"/>
-              </w:rPr>
-              <w:t xml:space="preserve">INSERTAR CAPTURA  ·  12-archivos-letsencrypt.png</w:t>
-            </w:r>
-          </w:p>
-          <w:p>
-            <w:pPr>
-              <w:spacing w:after="0"/>
-            </w:pPr>
-            <w:r>
-              <w:rPr>
-                <w:i/>
-                <w:iCs/>
-                <w:color w:val="6B4A00"/>
-                <w:sz w:val="20"/>
-                <w:szCs w:val="20"/>
-              </w:rPr>
-              <w:t xml:space="preserve">Listado de /etc/letsencrypt/live/santafe-pineda.shop/ mostrando los enlaces simbólicos, y el contenido de renewal/santafe-pineda.shop.conf.</w:t>
-            </w:r>
-          </w:p>
-        </w:tc>
-      </w:tr>
-    </w:tbl>
-    <w:p>
-      <w:pPr>
-        <w:spacing w:after="0"/>
-      </w:pPr>
-      <w:r>
-        <w:rPr>
-          <w:sz w:val="22"/>
-          <w:szCs w:val="22"/>
-        </w:rPr>
-        <w:t xml:space="preserve"/>
-      </w:r>
-    </w:p>
-    <w:tbl>
-      <w:tblPr>
-        <w:tblW w:type="dxa" w:w="9360"/>
-        <w:tblBorders>
-          <w:top w:val="single" w:color="auto" w:sz="4"/>
-          <w:left w:val="single" w:color="auto" w:sz="4"/>
-          <w:bottom w:val="single" w:color="auto" w:sz="4"/>
-          <w:right w:val="single" w:color="auto" w:sz="4"/>
-          <w:insideH w:val="single" w:color="auto" w:sz="4"/>
-          <w:insideV w:val="single" w:color="auto" w:sz="4"/>
-        </w:tblBorders>
-      </w:tblPr>
-      <w:tblGrid>
-        <w:gridCol w:w="9360"/>
-      </w:tblGrid>
-      <w:tr>
-        <w:tc>
-          <w:tcPr>
-            <w:tcW w:type="dxa" w:w="9360"/>
-            <w:tcBorders>
-              <w:top w:val="dashed" w:color="D9A441" w:sz="6"/>
-              <w:left w:val="dashed" w:color="D9A441" w:sz="6"/>
-              <w:bottom w:val="dashed" w:color="D9A441" w:sz="6"/>
-              <w:right w:val="dashed" w:color="D9A441" w:sz="6"/>
-            </w:tcBorders>
-            <w:shd w:fill="FFF7E6" w:color="auto" w:val="clear"/>
-            <w:tcMar>
-              <w:top w:type="dxa" w:w="160"/>
-              <w:left w:type="dxa" w:w="160"/>
-              <w:bottom w:type="dxa" w:w="160"/>
-              <w:right w:type="dxa" w:w="160"/>
-            </w:tcMar>
-          </w:tcPr>
-          <w:p>
-            <w:pPr>
-              <w:spacing w:after="60"/>
-            </w:pPr>
-            <w:r>
-              <w:rPr>
-                <w:b/>
-                <w:bCs/>
-                <w:color w:val="8A5A00"/>
-                <w:sz w:val="20"/>
-                <w:szCs w:val="20"/>
-              </w:rPr>
-              <w:t xml:space="preserve">INSERTAR CAPTURA  ·  13-nginx-editado.png</w:t>
-            </w:r>
-          </w:p>
-          <w:p>
-            <w:pPr>
-              <w:spacing w:after="0"/>
-            </w:pPr>
-            <w:r>
-              <w:rPr>
-                <w:i/>
-                <w:iCs/>
-                <w:color w:val="6B4A00"/>
-                <w:sz w:val="20"/>
-                <w:szCs w:val="20"/>
-              </w:rPr>
-              <w:t xml:space="preserve">El archivo sites-available/santafe-pineda.shop con las directivas ssl_certificate escritas a mano, sin comentarios "managed by Certbot".</w:t>
-            </w:r>
-          </w:p>
-        </w:tc>
-      </w:tr>
-    </w:tbl>
-    <w:p>
-      <w:pPr>
-        <w:spacing w:after="0"/>
-      </w:pPr>
-      <w:r>
-        <w:rPr>
-          <w:sz w:val="22"/>
-          <w:szCs w:val="22"/>
-        </w:rPr>
-        <w:t xml:space="preserve"/>
-      </w:r>
-    </w:p>
-    <w:tbl>
-      <w:tblPr>
-        <w:tblW w:type="dxa" w:w="9360"/>
-        <w:tblBorders>
-          <w:top w:val="single" w:color="auto" w:sz="4"/>
-          <w:left w:val="single" w:color="auto" w:sz="4"/>
-          <w:bottom w:val="single" w:color="auto" w:sz="4"/>
-          <w:right w:val="single" w:color="auto" w:sz="4"/>
-          <w:insideH w:val="single" w:color="auto" w:sz="4"/>
-          <w:insideV w:val="single" w:color="auto" w:sz="4"/>
-        </w:tblBorders>
-      </w:tblPr>
-      <w:tblGrid>
-        <w:gridCol w:w="9360"/>
-      </w:tblGrid>
-      <w:tr>
-        <w:tc>
-          <w:tcPr>
-            <w:tcW w:type="dxa" w:w="9360"/>
-            <w:tcBorders>
-              <w:top w:val="dashed" w:color="D9A441" w:sz="6"/>
-              <w:left w:val="dashed" w:color="D9A441" w:sz="6"/>
-              <w:bottom w:val="dashed" w:color="D9A441" w:sz="6"/>
-              <w:right w:val="dashed" w:color="D9A441" w:sz="6"/>
-            </w:tcBorders>
-            <w:shd w:fill="FFF7E6" w:color="auto" w:val="clear"/>
-            <w:tcMar>
-              <w:top w:type="dxa" w:w="160"/>
-              <w:left w:type="dxa" w:w="160"/>
-              <w:bottom w:type="dxa" w:w="160"/>
-              <w:right w:type="dxa" w:w="160"/>
-            </w:tcMar>
-          </w:tcPr>
-          <w:p>
-            <w:pPr>
-              <w:spacing w:after="60"/>
-            </w:pPr>
-            <w:r>
-              <w:rPr>
-                <w:b/>
-                <w:bCs/>
-                <w:color w:val="8A5A00"/>
-                <w:sz w:val="20"/>
-                <w:szCs w:val="20"/>
-              </w:rPr>
-              <w:t xml:space="preserve">INSERTAR CAPTURA  ·  14-renovacion-desactivada.png</w:t>
-            </w:r>
-          </w:p>
-          <w:p>
-            <w:pPr>
-              <w:spacing w:after="0"/>
-            </w:pPr>
-            <w:r>
-              <w:rPr>
-                <w:i/>
-                <w:iCs/>
-                <w:color w:val="6B4A00"/>
-                <w:sz w:val="20"/>
-                <w:szCs w:val="20"/>
-              </w:rPr>
-              <w:t xml:space="preserve">systemctl list-timers --all sin ningún temporizador de certbot.</w:t>
+              <w:t xml:space="preserve">Pendiente. Ejecutar en el servidor: systemctl list-timers --all | grep -i certbot  (la salida debe quedar vacia) y ls /etc/cron.d/ | grep -i certbot.</w:t>
             </w:r>
           </w:p>
         </w:tc>
@@ -8743,6 +8815,204 @@
         <w:t xml:space="preserve"/>
       </w:r>
     </w:p>
+    <w:p>
+      <w:pPr>
+        <w:spacing w:after="60" w:before="160"/>
+        <w:jc w:val="center"/>
+      </w:pPr>
+      <w:r>
+        <w:drawing>
+          <wp:inline distT="0" distB="0" distL="0" distR="0">
+            <wp:extent cx="5905500" cy="2533650"/>
+            <wp:effectExtent t="0" r="0" b="0" l="0"/>
+            <wp:docPr id="1" name="" descr="" title=""/>
+            <wp:cNvGraphicFramePr>
+              <a:graphicFrameLocks xmlns:a="http://schemas.openxmlformats.org/drawingml/2006/main" noChangeAspect="1"/>
+            </wp:cNvGraphicFramePr>
+            <a:graphic xmlns:a="http://schemas.openxmlformats.org/drawingml/2006/main">
+              <a:graphicData uri="http://schemas.openxmlformats.org/drawingml/2006/picture">
+                <pic:pic xmlns:pic="http://schemas.openxmlformats.org/drawingml/2006/picture">
+                  <pic:nvPicPr>
+                    <pic:cNvPr id="0" name="" descr=""/>
+                    <pic:cNvPicPr>
+                      <a:picLocks noChangeAspect="1" noChangeArrowheads="1"/>
+                    </pic:cNvPicPr>
+                  </pic:nvPicPr>
+                  <pic:blipFill>
+                    <a:blip r:embed="rId23" cstate="none"/>
+                    <a:srcRect/>
+                    <a:stretch>
+                      <a:fillRect/>
+                    </a:stretch>
+                  </pic:blipFill>
+                  <pic:spPr bwMode="auto">
+                    <a:xfrm>
+                      <a:off x="0" y="0"/>
+                      <a:ext cx="5905500" cy="2533650"/>
+                    </a:xfrm>
+                    <a:prstGeom prst="rect">
+                      <a:avLst/>
+                    </a:prstGeom>
+                  </pic:spPr>
+                </pic:pic>
+              </a:graphicData>
+            </a:graphic>
+          </wp:inline>
+        </w:drawing>
+      </w:r>
+    </w:p>
+    <w:p>
+      <w:pPr>
+        <w:spacing w:after="240"/>
+        <w:jc w:val="center"/>
+      </w:pPr>
+      <w:r>
+        <w:rPr>
+          <w:i/>
+          <w:iCs/>
+          <w:color w:val="555555"/>
+          <w:sz w:val="18"/>
+          <w:szCs w:val="18"/>
+        </w:rPr>
+        <w:t xml:space="preserve">Figura 16. Visor de certificados con el de Let’s Encrypt ya instalado: "Issued By: YE1, Let’s Encrypt". Comparese con la figura del certificado autofirmado, donde emisor y titular coincidian.</w:t>
+      </w:r>
+    </w:p>
+    <w:p>
+      <w:pPr>
+        <w:spacing w:after="60" w:before="160"/>
+        <w:jc w:val="center"/>
+      </w:pPr>
+      <w:r>
+        <w:drawing>
+          <wp:inline distT="0" distB="0" distL="0" distR="0">
+            <wp:extent cx="5905500" cy="6067425"/>
+            <wp:effectExtent t="0" r="0" b="0" l="0"/>
+            <wp:docPr id="1" name="" descr="" title=""/>
+            <wp:cNvGraphicFramePr>
+              <a:graphicFrameLocks xmlns:a="http://schemas.openxmlformats.org/drawingml/2006/main" noChangeAspect="1"/>
+            </wp:cNvGraphicFramePr>
+            <a:graphic xmlns:a="http://schemas.openxmlformats.org/drawingml/2006/main">
+              <a:graphicData uri="http://schemas.openxmlformats.org/drawingml/2006/picture">
+                <pic:pic xmlns:pic="http://schemas.openxmlformats.org/drawingml/2006/picture">
+                  <pic:nvPicPr>
+                    <pic:cNvPr id="0" name="" descr=""/>
+                    <pic:cNvPicPr>
+                      <a:picLocks noChangeAspect="1" noChangeArrowheads="1"/>
+                    </pic:cNvPicPr>
+                  </pic:nvPicPr>
+                  <pic:blipFill>
+                    <a:blip r:embed="rId24" cstate="none"/>
+                    <a:srcRect/>
+                    <a:stretch>
+                      <a:fillRect/>
+                    </a:stretch>
+                  </pic:blipFill>
+                  <pic:spPr bwMode="auto">
+                    <a:xfrm>
+                      <a:off x="0" y="0"/>
+                      <a:ext cx="5905500" cy="6067425"/>
+                    </a:xfrm>
+                    <a:prstGeom prst="rect">
+                      <a:avLst/>
+                    </a:prstGeom>
+                  </pic:spPr>
+                </pic:pic>
+              </a:graphicData>
+            </a:graphic>
+          </wp:inline>
+        </w:drawing>
+      </w:r>
+    </w:p>
+    <w:p>
+      <w:pPr>
+        <w:spacing w:after="240"/>
+        <w:jc w:val="center"/>
+      </w:pPr>
+      <w:r>
+        <w:rPr>
+          <w:i/>
+          <w:iCs/>
+          <w:color w:val="555555"/>
+          <w:sz w:val="18"/>
+          <w:szCs w:val="18"/>
+        </w:rPr>
+        <w:t xml:space="preserve">Figura 17. Cadena de certificacion completa hasta ISRG Root X1 y resultado de la validacion: Verify return code: 0 (ok).</w:t>
+      </w:r>
+    </w:p>
+    <w:p>
+      <w:pPr>
+        <w:spacing w:after="60" w:before="160"/>
+        <w:jc w:val="center"/>
+      </w:pPr>
+      <w:r>
+        <w:drawing>
+          <wp:inline distT="0" distB="0" distL="0" distR="0">
+            <wp:extent cx="5905500" cy="5133975"/>
+            <wp:effectExtent t="0" r="0" b="0" l="0"/>
+            <wp:docPr id="1" name="" descr="" title=""/>
+            <wp:cNvGraphicFramePr>
+              <a:graphicFrameLocks xmlns:a="http://schemas.openxmlformats.org/drawingml/2006/main" noChangeAspect="1"/>
+            </wp:cNvGraphicFramePr>
+            <a:graphic xmlns:a="http://schemas.openxmlformats.org/drawingml/2006/main">
+              <a:graphicData uri="http://schemas.openxmlformats.org/drawingml/2006/picture">
+                <pic:pic xmlns:pic="http://schemas.openxmlformats.org/drawingml/2006/picture">
+                  <pic:nvPicPr>
+                    <pic:cNvPr id="0" name="" descr=""/>
+                    <pic:cNvPicPr>
+                      <a:picLocks noChangeAspect="1" noChangeArrowheads="1"/>
+                    </pic:cNvPicPr>
+                  </pic:nvPicPr>
+                  <pic:blipFill>
+                    <a:blip r:embed="rId25" cstate="none"/>
+                    <a:srcRect/>
+                    <a:stretch>
+                      <a:fillRect/>
+                    </a:stretch>
+                  </pic:blipFill>
+                  <pic:spPr bwMode="auto">
+                    <a:xfrm>
+                      <a:off x="0" y="0"/>
+                      <a:ext cx="5905500" cy="5133975"/>
+                    </a:xfrm>
+                    <a:prstGeom prst="rect">
+                      <a:avLst/>
+                    </a:prstGeom>
+                  </pic:spPr>
+                </pic:pic>
+              </a:graphicData>
+            </a:graphic>
+          </wp:inline>
+        </w:drawing>
+      </w:r>
+    </w:p>
+    <w:p>
+      <w:pPr>
+        <w:spacing w:after="240"/>
+        <w:jc w:val="center"/>
+      </w:pPr>
+      <w:r>
+        <w:rPr>
+          <w:i/>
+          <w:iCs/>
+          <w:color w:val="555555"/>
+          <w:sz w:val="18"/>
+          <w:szCs w:val="18"/>
+        </w:rPr>
+        <w:t xml:space="preserve">Figura 18. Resultado de la bateria de comprobaciones: TLS 1.0 y 1.1 rechazados, TLS 1.2 y 1.3 aceptados.</w:t>
+      </w:r>
+    </w:p>
+    <w:p>
+      <w:pPr>
+        <w:spacing w:after="0"/>
+      </w:pPr>
+      <w:r>
+        <w:rPr>
+          <w:sz w:val="22"/>
+          <w:szCs w:val="22"/>
+        </w:rPr>
+        <w:t xml:space="preserve"/>
+      </w:r>
+    </w:p>
     <w:tbl>
       <w:tblPr>
         <w:tblW w:type="dxa" w:w="9360"/>
@@ -8788,7 +9058,7 @@
                 <w:sz w:val="20"/>
                 <w:szCs w:val="20"/>
               </w:rPr>
-              <w:t xml:space="preserve">INSERTAR CAPTURA  ·  15-firefox-candado.png</w:t>
+              <w:t xml:space="preserve">INSERTAR CAPTURA  ·  16-redireccion-301.png</w:t>
             </w:r>
           </w:p>
           <w:p>
@@ -8803,7 +9073,7 @@
                 <w:sz w:val="20"/>
                 <w:szCs w:val="20"/>
               </w:rPr>
-              <w:t xml:space="preserve">Firefox sobre https://santafe-pineda.shop/ con el candado cerrado y el panel de conexión segura indicando "Verificado por: Let’s Encrypt".</w:t>
+              <w:t xml:space="preserve">Pendiente. Ejecutar: curl -I http://santafe-pineda.shop/login  La respuesta debe ser 301 con la cabecera Location hacia https.</w:t>
             </w:r>
           </w:p>
         </w:tc>
@@ -8866,7 +9136,7 @@
                 <w:sz w:val="20"/>
                 <w:szCs w:val="20"/>
               </w:rPr>
-              <w:t xml:space="preserve">INSERTAR CAPTURA  ·  16-redireccion-301.png</w:t>
+              <w:t xml:space="preserve">INSERTAR CAPTURA  ·  17-ssllabs-A.png</w:t>
             </w:r>
           </w:p>
           <w:p>
@@ -8881,85 +9151,7 @@
                 <w:sz w:val="20"/>
                 <w:szCs w:val="20"/>
               </w:rPr>
-              <w:t xml:space="preserve">curl -I http://santafe-pineda.shop/ devolviendo 301 y la cabecera Location hacia https.</w:t>
-            </w:r>
-          </w:p>
-        </w:tc>
-      </w:tr>
-    </w:tbl>
-    <w:p>
-      <w:pPr>
-        <w:spacing w:after="0"/>
-      </w:pPr>
-      <w:r>
-        <w:rPr>
-          <w:sz w:val="22"/>
-          <w:szCs w:val="22"/>
-        </w:rPr>
-        <w:t xml:space="preserve"/>
-      </w:r>
-    </w:p>
-    <w:tbl>
-      <w:tblPr>
-        <w:tblW w:type="dxa" w:w="9360"/>
-        <w:tblBorders>
-          <w:top w:val="single" w:color="auto" w:sz="4"/>
-          <w:left w:val="single" w:color="auto" w:sz="4"/>
-          <w:bottom w:val="single" w:color="auto" w:sz="4"/>
-          <w:right w:val="single" w:color="auto" w:sz="4"/>
-          <w:insideH w:val="single" w:color="auto" w:sz="4"/>
-          <w:insideV w:val="single" w:color="auto" w:sz="4"/>
-        </w:tblBorders>
-      </w:tblPr>
-      <w:tblGrid>
-        <w:gridCol w:w="9360"/>
-      </w:tblGrid>
-      <w:tr>
-        <w:tc>
-          <w:tcPr>
-            <w:tcW w:type="dxa" w:w="9360"/>
-            <w:tcBorders>
-              <w:top w:val="dashed" w:color="D9A441" w:sz="6"/>
-              <w:left w:val="dashed" w:color="D9A441" w:sz="6"/>
-              <w:bottom w:val="dashed" w:color="D9A441" w:sz="6"/>
-              <w:right w:val="dashed" w:color="D9A441" w:sz="6"/>
-            </w:tcBorders>
-            <w:shd w:fill="FFF7E6" w:color="auto" w:val="clear"/>
-            <w:tcMar>
-              <w:top w:type="dxa" w:w="160"/>
-              <w:left w:type="dxa" w:w="160"/>
-              <w:bottom w:type="dxa" w:w="160"/>
-              <w:right w:type="dxa" w:w="160"/>
-            </w:tcMar>
-          </w:tcPr>
-          <w:p>
-            <w:pPr>
-              <w:spacing w:after="60"/>
-            </w:pPr>
-            <w:r>
-              <w:rPr>
-                <w:b/>
-                <w:bCs/>
-                <w:color w:val="8A5A00"/>
-                <w:sz w:val="20"/>
-                <w:szCs w:val="20"/>
-              </w:rPr>
-              <w:t xml:space="preserve">INSERTAR CAPTURA  ·  17-ssllabs-A.png</w:t>
-            </w:r>
-          </w:p>
-          <w:p>
-            <w:pPr>
-              <w:spacing w:after="0"/>
-            </w:pPr>
-            <w:r>
-              <w:rPr>
-                <w:i/>
-                <w:iCs/>
-                <w:color w:val="6B4A00"/>
-                <w:sz w:val="20"/>
-                <w:szCs w:val="20"/>
-              </w:rPr>
-              <w:t xml:space="preserve">Informe de SSL Labs con calificación A o A+ y la cadena de certificación completa.</w:t>
+              <w:t xml:space="preserve">Pendiente. Repetir la prueba de SSL Labs ahora que el certificado es de Let’s Encrypt: la calificacion debe pasar de T a A.</w:t>
             </w:r>
           </w:p>
         </w:tc>

</xml_diff>